<commit_message>
Update ML SD M22 Revision Roadmap
</commit_message>
<xml_diff>
--- a/ML_System_Design/ML_SD_M22_Revision_Roadmap.docx
+++ b/ML_System_Design/ML_SD_M22_Revision_Roadmap.docx
@@ -10327,37 +10327,31 @@
           <w:i/>
           <w:iCs/>
         </w:rPr>
-        <w:t xml:space="preserve">Module 23 — Capstone &amp; Final Assessment.</w:t>
-      </w:r>
-      <w:r>
-        <w:t xml:space="preserve"> </w:t>
-      </w:r>
-      <w:r>
-        <w:t xml:space="preserve">You have the map;</w:t>
-      </w:r>
-      <w:r>
-        <w:t xml:space="preserve"> </w:t>
-      </w:r>
-      <w:r>
-        <w:t xml:space="preserve">now you drive the whole route unaided. Module 23 puts you through a full-length,</w:t>
-      </w:r>
-      <w:r>
-        <w:t xml:space="preserve"> </w:t>
-      </w:r>
-      <w:r>
-        <w:t xml:space="preserve">timed capstone design plus a final self-assessment, so you can prove — to</w:t>
-      </w:r>
-      <w:r>
-        <w:t xml:space="preserve"> </w:t>
-      </w:r>
-      <w:r>
-        <w:t xml:space="preserve">yourself and to an interviewer — that the 7-step spine and every pattern in this</w:t>
-      </w:r>
-      <w:r>
-        <w:t xml:space="preserve"> </w:t>
-      </w:r>
-      <w:r>
-        <w:t xml:space="preserve">revision are truly automatic.</w:t>
+        <w:t xml:space="preserve">Module 23 — Competitive Exam Mapping (SEBI / RBI / GATE / ISRO).</w:t>
+      </w:r>
+      <w:r>
+        <w:t xml:space="preserve"> </w:t>
+      </w:r>
+      <w:r>
+        <w:t xml:space="preserve">This revision module gave you the interview-ready map; Module 23 — the final</w:t>
+      </w:r>
+      <w:r>
+        <w:t xml:space="preserve"> </w:t>
+      </w:r>
+      <w:r>
+        <w:t xml:space="preserve">module — shows exactly which parts of the course carry weight in written exams</w:t>
+      </w:r>
+      <w:r>
+        <w:t xml:space="preserve"> </w:t>
+      </w:r>
+      <w:r>
+        <w:t xml:space="preserve">(SEBI Grade A IT, RBI Grade B IT, GATE CS/DA, ISRO/DRDO), with a topic→exam</w:t>
+      </w:r>
+      <w:r>
+        <w:t xml:space="preserve"> </w:t>
+      </w:r>
+      <w:r>
+        <w:t xml:space="preserve">matrix and PYQ-style practice questions.</w:t>
       </w:r>
     </w:p>
     <w:bookmarkEnd w:id="57"/>

</xml_diff>